<commit_message>
feature/proofcardlist: complete logic without large files
</commit_message>
<xml_diff>
--- a/DOCS/API_SPEC_ZH.docx
+++ b/DOCS/API_SPEC_ZH.docx
@@ -752,7 +752,17 @@
         <w:t>參數</w:t>
       </w:r>
       <w:r>
-        <w:t xml:space="preserve"> (`query string`): `context` -&gt; 會強烈影響回傳的資料多寡！(例如帶入 `context=dispute`)</w:t>
+        <w:t xml:space="preserve"> (`query string`): </w:t>
+      </w:r>
+    </w:p>
+    <w:p>
+      <w:r>
+        <w:t xml:space="preserve">  - `context` -&gt; 會強烈影響回傳的資料多寡！(例如帶入 `context=dispute`)</w:t>
+      </w:r>
+    </w:p>
+    <w:p>
+      <w:r>
+        <w:t xml:space="preserve">  - `fields` -&gt; (新增) 帶入 `fields=pc_min` 可強制後端在序列化前拋棄巨大的 payload 陣列，達成毫秒級的高速回傳，專供歷史列表的極簡視圖使用。</w:t>
       </w:r>
     </w:p>
     <w:p>
@@ -930,6 +940,122 @@
       </w:r>
       <w:r>
         <w:t>：`{"episode_id": "ep-xxxx"}`</w:t>
+      </w:r>
+    </w:p>
+    <w:p>
+      <w:pPr>
+        <w:pStyle w:val="Heading2"/>
+      </w:pPr>
+      <w:r>
+        <w:t>3.6 GET /obh/history_summary</w:t>
+      </w:r>
+    </w:p>
+    <w:p>
+      <w:pPr>
+        <w:pStyle w:val="ListBullet"/>
+      </w:pPr>
+      <w:r>
+        <w:rPr>
+          <w:b/>
+        </w:rPr>
+        <w:t>說明</w:t>
+      </w:r>
+      <w:r>
+        <w:t>：(新增) 取得系統中所有已保存的 Proof Card 的輕量化歷史紀錄清單，陣列依時間由新到舊排序。</w:t>
+      </w:r>
+    </w:p>
+    <w:p>
+      <w:pPr>
+        <w:pStyle w:val="ListBullet"/>
+      </w:pPr>
+      <w:r>
+        <w:rPr>
+          <w:b/>
+        </w:rPr>
+        <w:t>輸出</w:t>
+      </w:r>
+      <w:r>
+        <w:t>：</w:t>
+      </w:r>
+    </w:p>
+    <w:p>
+      <w:r>
+        <w:t xml:space="preserve">  ```json</w:t>
+      </w:r>
+    </w:p>
+    <w:p>
+      <w:r>
+        <w:t xml:space="preserve">  {</w:t>
+      </w:r>
+    </w:p>
+    <w:p>
+      <w:r>
+        <w:t xml:space="preserve">    "status": "Success",</w:t>
+      </w:r>
+    </w:p>
+    <w:p>
+      <w:r>
+        <w:t xml:space="preserve">    "history": [</w:t>
+      </w:r>
+    </w:p>
+    <w:p>
+      <w:r>
+        <w:t xml:space="preserve">      {</w:t>
+      </w:r>
+    </w:p>
+    <w:p>
+      <w:r>
+        <w:t xml:space="preserve">        "episode_id": "ep-xxxx",</w:t>
+      </w:r>
+    </w:p>
+    <w:p>
+      <w:r>
+        <w:t xml:space="preserve">        "profile_ref": "WIFI78_INSTALL_ACCEPT",</w:t>
+      </w:r>
+    </w:p>
+    <w:p>
+      <w:r>
+        <w:t xml:space="preserve">        "window_ref": "W-LATEST-100",</w:t>
+      </w:r>
+    </w:p>
+    <w:p>
+      <w:r>
+        <w:t xml:space="preserve">        "verdict": "FAIL",</w:t>
+      </w:r>
+    </w:p>
+    <w:p>
+      <w:r>
+        <w:t xml:space="preserve">        "time": "2023-10-27T10:00:00Z",</w:t>
+      </w:r>
+    </w:p>
+    <w:p>
+      <w:r>
+        <w:t xml:space="preserve">        "is_dispute": true,</w:t>
+      </w:r>
+    </w:p>
+    <w:p>
+      <w:r>
+        <w:t xml:space="preserve">        "is_signed": false</w:t>
+      </w:r>
+    </w:p>
+    <w:p>
+      <w:r>
+        <w:t xml:space="preserve">      }</w:t>
+      </w:r>
+    </w:p>
+    <w:p>
+      <w:r>
+        <w:t xml:space="preserve">    ]</w:t>
+      </w:r>
+    </w:p>
+    <w:p>
+      <w:r>
+        <w:t xml:space="preserve">  }</w:t>
+      </w:r>
+    </w:p>
+    <w:p>
+      <w:r>
+        <w:t xml:space="preserve">  ```</w:t>
       </w:r>
     </w:p>
     <w:p>

</xml_diff>